<commit_message>
siem-forwarder: update SDD to v1.3 — sync design doc to code
Brings siemForwarder-SDD.docx in line with the v1.3 code changes:
- §11.1: add four confirmed defects (getHandle->Object, Clock.ticks deadband
  units, fail-open on missing AlarmService, partial alarm-subscription leak)
- §11.2: engine-hog corrected (no public getEngineHog()); alarm forwarding
  documented as implemented via transient Topic subscriber; audit scoped to
  native remote syslog
- §11 intro: record 4.10<->4.15 re-verification (used API surface identical)
- reconcile "audit forwarded unconditionally" claims (6.2/9.3/10.2/7.1) to
  points+alarms only; name the BajaSSLSocketFactory TLS anchor (9.2)
- cover/header/revision history -> 1.3 (Draft), 15 July 2026

Co-Authored-By: Claude Opus 4.8 <noreply@anthropic.com>
</commit_message>
<xml_diff>
--- a/siem-forwarder/siemForwarder-SDD.docx
+++ b/siem-forwarder/siemForwarder-SDD.docx
@@ -314,7 +314,7 @@
                 <w:sz w:val="18"/>
                 <w:szCs w:val="18"/>
               </w:rPr>
-              <w:t>1.2 (Draft)</w:t>
+              <w:t>1.3 (Draft)</w:t>
             </w:r>
           </w:p>
         </w:tc>
@@ -382,7 +382,7 @@
                 <w:sz w:val="18"/>
                 <w:szCs w:val="18"/>
               </w:rPr>
-              <w:t>2 July 2026</w:t>
+              <w:t>15 July 2026</w:t>
             </w:r>
           </w:p>
         </w:tc>
@@ -3068,6 +3068,138 @@
           </w:p>
         </w:tc>
       </w:tr>
+      <w:tr>
+        <w:tblPrEx>
+          <w:tblCellMar>
+            <w:top w:w="0" w:type="dxa"/>
+            <w:bottom w:w="0" w:type="dxa"/>
+          </w:tblCellMar>
+        </w:tblPrEx>
+        <w:tc>
+          <w:tcPr>
+            <w:tcW w:w="1100" w:type="dxa"/>
+            <w:tcBorders>
+              <w:top w:val="single" w:sz="1" w:space="0" w:color="BFBFBF"/>
+              <w:left w:val="single" w:sz="1" w:space="0" w:color="BFBFBF"/>
+              <w:bottom w:val="single" w:sz="1" w:space="0" w:color="BFBFBF"/>
+              <w:right w:val="single" w:sz="1" w:space="0" w:color="BFBFBF"/>
+            </w:tcBorders>
+            <w:shd w:val="clear" w:color="auto" w:fill="FFFFFF"/>
+            <w:tcMar>
+              <w:top w:w="55" w:type="dxa"/>
+              <w:left w:w="110" w:type="dxa"/>
+              <w:bottom w:w="55" w:type="dxa"/>
+              <w:right w:w="110" w:type="dxa"/>
+            </w:tcMar>
+            <w:vAlign w:val="center"/>
+          </w:tcPr>
+          <w:p>
+            <w:pPr>
+              <w:spacing w:line="248" w:lineRule="auto"/>
+            </w:pPr>
+            <w:r>
+              <w:rPr>
+                <w:sz w:val="18"/>
+                <w:szCs w:val="18"/>
+              </w:rPr>
+              <w:t>1.3</w:t>
+            </w:r>
+          </w:p>
+        </w:tc>
+        <w:tc>
+          <w:tcPr>
+            <w:tcW w:w="1500" w:type="dxa"/>
+            <w:tcBorders>
+              <w:top w:val="single" w:sz="1" w:space="0" w:color="BFBFBF"/>
+              <w:left w:val="single" w:sz="1" w:space="0" w:color="BFBFBF"/>
+              <w:bottom w:val="single" w:sz="1" w:space="0" w:color="BFBFBF"/>
+              <w:right w:val="single" w:sz="1" w:space="0" w:color="BFBFBF"/>
+            </w:tcBorders>
+            <w:shd w:val="clear" w:color="auto" w:fill="FFFFFF"/>
+            <w:tcMar>
+              <w:top w:w="55" w:type="dxa"/>
+              <w:left w:w="110" w:type="dxa"/>
+              <w:bottom w:w="55" w:type="dxa"/>
+              <w:right w:w="110" w:type="dxa"/>
+            </w:tcMar>
+            <w:vAlign w:val="center"/>
+          </w:tcPr>
+          <w:p>
+            <w:pPr>
+              <w:spacing w:line="248" w:lineRule="auto"/>
+            </w:pPr>
+            <w:r>
+              <w:rPr>
+                <w:sz w:val="18"/>
+                <w:szCs w:val="18"/>
+              </w:rPr>
+              <w:t>2026-07-15</w:t>
+            </w:r>
+          </w:p>
+        </w:tc>
+        <w:tc>
+          <w:tcPr>
+            <w:tcW w:w="3260" w:type="dxa"/>
+            <w:tcBorders>
+              <w:top w:val="single" w:sz="1" w:space="0" w:color="BFBFBF"/>
+              <w:left w:val="single" w:sz="1" w:space="0" w:color="BFBFBF"/>
+              <w:bottom w:val="single" w:sz="1" w:space="0" w:color="BFBFBF"/>
+              <w:right w:val="single" w:sz="1" w:space="0" w:color="BFBFBF"/>
+            </w:tcBorders>
+            <w:shd w:val="clear" w:color="auto" w:fill="FFFFFF"/>
+            <w:tcMar>
+              <w:top w:w="55" w:type="dxa"/>
+              <w:left w:w="110" w:type="dxa"/>
+              <w:bottom w:w="55" w:type="dxa"/>
+              <w:right w:w="110" w:type="dxa"/>
+            </w:tcMar>
+            <w:vAlign w:val="center"/>
+          </w:tcPr>
+          <w:p>
+            <w:pPr>
+              <w:spacing w:line="248" w:lineRule="auto"/>
+            </w:pPr>
+            <w:r>
+              <w:rPr>
+                <w:sz w:val="18"/>
+                <w:szCs w:val="18"/>
+              </w:rPr>
+              <w:t>Design review</w:t>
+            </w:r>
+          </w:p>
+        </w:tc>
+        <w:tc>
+          <w:tcPr>
+            <w:tcW w:w="3500" w:type="dxa"/>
+            <w:tcBorders>
+              <w:top w:val="single" w:sz="1" w:space="0" w:color="BFBFBF"/>
+              <w:left w:val="single" w:sz="1" w:space="0" w:color="BFBFBF"/>
+              <w:bottom w:val="single" w:sz="1" w:space="0" w:color="BFBFBF"/>
+              <w:right w:val="single" w:sz="1" w:space="0" w:color="BFBFBF"/>
+            </w:tcBorders>
+            <w:shd w:val="clear" w:color="auto" w:fill="FFFFFF"/>
+            <w:tcMar>
+              <w:top w:w="55" w:type="dxa"/>
+              <w:left w:w="110" w:type="dxa"/>
+              <w:bottom w:w="55" w:type="dxa"/>
+              <w:right w:w="110" w:type="dxa"/>
+            </w:tcMar>
+            <w:vAlign w:val="center"/>
+          </w:tcPr>
+          <w:p>
+            <w:pPr>
+              <w:spacing w:line="248" w:lineRule="auto"/>
+            </w:pPr>
+            <w:r>
+              <w:rPr>
+                <w:sz w:val="18"/>
+                <w:szCs w:val="18"/>
+              </w:rPr>
+              <w:t>Re-verified all framework call sites against Niagara 4.10 and 4.15 (used API surface identical across the range). Fixed two further code defects: BComponent.getHandle() returns Object, not a Handle type, and the per-point deadband compared Clock.ticks() (undocumented unit) against a millisecond interval (now System.nanoTime()-based). Implemented alarm forwarding via a transient alarm-class Topic subscriber. Scoped audit out to native remote syslog (Sec. 10.3). Corrected the engine-hog note (no public getEngineHog()) and named the TLS platform-cert anchor. Two follow-on fixes from automated pre-push review: fail-open on missing AlarmService, and release of partial alarm subscriptions on setup failure.</w:t>
+            </w:r>
+          </w:p>
+        </w:tc>
+      </w:tr>
     </w:tbl>
     <w:p>
       <w:pPr>
@@ -7166,7 +7298,7 @@
         <w:spacing w:after="120" w:line="276" w:lineRule="auto"/>
       </w:pPr>
       <w:r>
-        <w:t>Alarm and audit records bypass the ride-along gate entirely: they are generated inside the station and never cause field traffic, so they are forwarded unconditionally (still subject to the bounded queue and throttle).</w:t>
+        <w:t>Alarms bypass the ride-along gate entirely: they are generated inside the station and never cause field traffic, so they are forwarded unconditionally (still subject to the bounded queue and throttle). Audit records are deliberately not forwarded by this module; that control family is covered by Niagara's native remote syslog (Sec. 10.3, Sec. 11.2).</w:t>
       </w:r>
     </w:p>
     <w:p>
@@ -7735,7 +7867,7 @@
           <w:sz w:val="18"/>
           <w:szCs w:val="18"/>
         </w:rPr>
-        <w:t>Design note: the reference skeleton approximates engine hog from clock jitter to stay dependency-free. Production builds should replace this with the authoritative reading from the target build's EngineWatchdog/SysManager diagnostics (Sec. 11.2). Separately, the THROTTLING state this monitor computes is not yet consulted anywhere the data path can act on it — see Sec. 11.2 for the required wiring into offer().</w:t>
+        <w:t>Design note: the reference skeleton approximates engine hog from clock jitter to stay dependency-free. A v1.3 review confirmed there is no public BEngineWatchdogService.getEngineHog() in the 4.15 API, so the jitter proxy may be the best signal available; a production build wanting an authoritative value must source it from the engine-manager diagnostics and confirm the exact type on the target build (Sec. 11.2). The THROTTLING state this monitor computes is consulted from the data path via SelfThrottleMonitor.admits(), called in BSiemForwarderService.offer().</w:t>
       </w:r>
     </w:p>
     <w:p>
@@ -8887,7 +9019,7 @@
                 <w:sz w:val="18"/>
                 <w:szCs w:val="18"/>
               </w:rPr>
-              <w:t>Enable audit-history forwarding.</w:t>
+              <w:t>Retained for operator use; audit is not forwarded by this module (Sec. 10.3, 11.2).</w:t>
             </w:r>
           </w:p>
         </w:tc>
@@ -10710,7 +10842,7 @@
         <w:spacing w:after="120" w:line="276" w:lineRule="auto"/>
       </w:pPr>
       <w:r>
-        <w:t>Egress uses TLS (RFC 5425) to the SIEM collector on TCP 6514 by default. Server-certificate trust is anchored in the platform trust store. The connection carries only event metadata outbound; the module opens no listening socket and accepts no inbound control, minimizing its attack surface.</w:t>
+        <w:t>Egress uses TLS (RFC 5425) to the SIEM collector on TCP 6514 by default. Server-certificate trust is anchored in the platform trust store; the skeleton currently uses the JVM-default store with hostname (endpoint-identification) verification enabled, and anchoring in the platform certificate store is a target-build bind point (candidate anchor javax.baja.security.crypto.se.BajaSSLSocketFactory; Sec. 11.2). The connection carries only event metadata outbound; the module opens no listening socket and accepts no inbound control, minimizing its attack surface.</w:t>
       </w:r>
     </w:p>
     <w:p>
@@ -10733,7 +10865,7 @@
     </w:p>
     <w:p>
       <w:r>
-        <w:t>Monitoring-coverage caveat. Because the ride-along rule (Sec. 6.2) forwards only points that some other component keeps subscribed, point coverage is opportunistic and can change at runtime as Px views open and close or history extensions are added and removed. A point with no standing external subscriber is never visible to the SIEM — by design, since subscribing it would add RS-485 traffic and violate G2. Where a point must be guaranteed in the feed, give it a standing subscriber (typically a history extension); this also makes the monitored set deterministic for the accreditation evidence. Alarm and audit records are unaffected: they bypass the ride-along gate and are forwarded unconditionally.</w:t>
+        <w:t>Monitoring-coverage caveat. Because the ride-along rule (Sec. 6.2) forwards only points that some other component keeps subscribed, point coverage is opportunistic and can change at runtime as Px views open and close or history extensions are added and removed. A point with no standing external subscriber is never visible to the SIEM — by design, since subscribing it would add RS-485 traffic and violate G2. Where a point must be guaranteed in the feed, give it a standing subscriber (typically a history extension); this also makes the monitored set deterministic for the accreditation evidence. Alarms are unaffected: they bypass the ride-along gate and are forwarded unconditionally. Audit is handled by native remote syslog rather than by this module (Sec. 10.3).</w:t>
       </w:r>
     </w:p>
     <w:p>
@@ -11750,7 +11882,7 @@
                 <w:sz w:val="18"/>
                 <w:szCs w:val="18"/>
               </w:rPr>
-              <w:t>Generates and forwards audit/alarm/point events with structured fields to a central SIEM; pair with native syslog for platform/audit logs.</w:t>
+              <w:t>Generates and forwards alarm and point events with structured fields to a central SIEM; audit and platform logs are covered by Niagara's native remote syslog (Sec. 10.3).</w:t>
             </w:r>
           </w:p>
         </w:tc>
@@ -12201,7 +12333,7 @@
         <w:spacing w:after="120" w:line="276" w:lineRule="auto"/>
       </w:pPr>
       <w:r>
-        <w:t>The architecture and threading model (Sec. 4–6) are sound and do not need to change. This section was revised after a code-level review of the skeleton against the compiled classes of a real Niagara 4.15.1.16 runtime (methodology detailed in Appendix B), which surfaced two distinct categories of work. Section 11.1 lists calls that are not merely unbound — they use signatures or methods that do not exist in the real API and will fail to compile as written. Section 11.2 lists genuine target-build bind points, where the design intentionally leaves a seam for the implementer. Treat 11.1 as required rewrites, not configuration. As of v1.2 every 11.1 item has been applied to the skeleton source (along with the second-review fixes recorded in the revision history); the list is retained below as the verification record for those rewrites. The remaining open work is the genuine bind points of 11.2, minus item 4's offer()/admits() wiring, which is now done.</w:t>
+        <w:t>The architecture and threading model (Sec. 4–6) are sound and do not need to change. This section was revised after a code-level review of the skeleton against the compiled classes of a real Niagara 4.15.1.16 runtime (methodology detailed in Appendix B), which surfaced two distinct categories of work. Section 11.1 lists calls that are not merely unbound — they use signatures or methods that do not exist in the real API and will fail to compile as written. Section 11.2 lists genuine target-build bind points, where the design intentionally leaves a seam for the implementer. Treat 11.1 as required rewrites, not configuration. As of v1.2 every 11.1 item has been applied to the skeleton source (along with the second-review fixes recorded in the revision history); the list is retained below as the verification record for those rewrites. The remaining open work is the genuine bind points of 11.2. A v1.3 review re-verified every call site against both Niagara 4.10 and 4.15 — the module's stated floor and a current build — and found the used API surface identical across that range; it surfaced two further code defects, both now fixed (items 7-8 below); it implemented alarm forwarding against the public javax.baja.alarm API (closing the alarm half of 11.2 item 4); and it scoped audit out of this module in favour of native remote syslog (Sec. 10.3). Two follow-on fixes from an automated pre-push review are recorded as items 9-10.</w:t>
       </w:r>
     </w:p>
     <w:p>
@@ -12303,6 +12435,58 @@
     </w:p>
     <w:p>
       <w:pPr>
+        <w:pStyle w:val="ListParagraph"/>
+        <w:numPr>
+          <w:ilvl w:val="0"/>
+          <w:numId w:val="6"/>
+        </w:numPr>
+        <w:spacing w:after="60" w:line="276" w:lineRule="auto"/>
+      </w:pPr>
+      <w:r>
+        <w:t>RideAlongSubscriber declared its attach/deadband map and scan set with a Handle key type and assigned Handle h = pt.getHandle(). No javax.baja.sys.Handle type exists, and BComponent.getHandle() returns java.lang.Object (confirmed on both 4.10 and 4.15), so this does not compile. Fixed by keying the map and set on Object.</w:t>
+      </w:r>
+    </w:p>
+    <w:p>
+      <w:pPr>
+        <w:pStyle w:val="ListParagraph"/>
+        <w:numPr>
+          <w:ilvl w:val="0"/>
+          <w:numId w:val="6"/>
+        </w:numPr>
+        <w:spacing w:after="60" w:line="276" w:lineRule="auto"/>
+      </w:pPr>
+      <w:r>
+        <w:t>The per-point deadband compared Clock.ticks() directly against minIntervalMs in milliseconds. Clock.ticks() has an undocumented unit — a sibling Clock.nanoTicks() also exists — so if ticks() is nanoseconds the rate limit was wrong by roughly a factor of one million. Fixed by using System.nanoTime() versus minIntervalMs * 1_000_000.</w:t>
+      </w:r>
+    </w:p>
+    <w:p>
+      <w:pPr>
+        <w:pStyle w:val="ListParagraph"/>
+        <w:numPr>
+          <w:ilvl w:val="0"/>
+          <w:numId w:val="6"/>
+        </w:numPr>
+        <w:spacing w:after="60" w:line="276" w:lineRule="auto"/>
+      </w:pPr>
+      <w:r>
+        <w:t>subscribeAlarms() used Sys.getService(BAlarmService.TYPE) guarded by a null check, but that method throws ServiceNotFoundException when no alarm service is registered; on such a station the exception propagated out of serviceStarted() and disabled point forwarding too — a fail-open violation. Fixed to use Sys.getServices() (empty array, no throw) and to fail open. (Automated pre-push review.)</w:t>
+      </w:r>
+    </w:p>
+    <w:p>
+      <w:pPr>
+        <w:pStyle w:val="ListParagraph"/>
+        <w:numPr>
+          <w:ilvl w:val="0"/>
+          <w:numId w:val="6"/>
+        </w:numPr>
+        <w:spacing w:after="60" w:line="276" w:lineRule="auto"/>
+      </w:pPr>
+      <w:r>
+        <w:t>On a mid-loop subscribe() failure the alarm setup nulled its Subscriber without unsubscribing the classes already attached, leaking a live subscriber that stop() could no longer release. Fixed by unsubscribing before dropping the reference. (Automated pre-push review.)</w:t>
+      </w:r>
+    </w:p>
+    <w:p>
+      <w:pPr>
         <w:spacing w:after="120" w:line="276" w:lineRule="auto"/>
       </w:pPr>
       <w:r>
@@ -12363,7 +12547,7 @@
         <w:spacing w:after="60" w:line="276" w:lineRule="auto"/>
       </w:pPr>
       <w:r>
-        <w:t>Replace the clock-jitter engine-hog approximation with the authoritative EngineWatchdog / SysManager reading for the target build.</w:t>
+        <w:t>Engine-hog reading: no public BEngineWatchdogService.getEngineHog() exists in 4.15 (verified against the corpus), so the earlier note was mistaken. The clock-jitter proxy may be the best signal available; if an authoritative value is required, source it from the engine-manager diagnostics and confirm the type on the target build before wiring it in.</w:t>
       </w:r>
     </w:p>
     <w:p>
@@ -12377,7 +12561,7 @@
       </w:pPr>
       <w:r>
         <w:lastRenderedPageBreak/>
-        <w:t>Wire hookAlarmAndAudit() to the concrete BAlarmService and BAuditHistoryService listener types on the target; also confirm SelfThrottleMonitor.admits() is actually consulted from BSiemForwarderService.offer() for THROTTLING, not only for SUSPENDED as in the current skeleton.</w:t>
+        <w:t>Alarm forwarding is implemented: RideAlongSubscriber.subscribeAlarms() attaches a transient Subscriber to every class from BAlarmService.getAlarmClasses() and catches its public alarm Topic (the TOPIC_FIRED event carries the BAlarmRecord via getValue()), writing nothing to the config DB. Audit is deliberately not forwarded here — its transient seam requires the com.tridium.history.audit.* internal classes, so audit and platform logs are left to native remote syslog (Sec. 10.3). SelfThrottleMonitor.admits() is consulted from BSiemForwarderService.offer() for both THROTTLING and SUSPENDED.</w:t>
       </w:r>
     </w:p>
     <w:p>
@@ -15317,7 +15501,7 @@
         <w:sz w:val="16"/>
         <w:szCs w:val="16"/>
       </w:rPr>
-      <w:t>0  ·</w:t>
+      <w:t>3  ·</w:t>
     </w:r>
     <w:proofErr w:type="gramEnd"/>
     <w:r>

</xml_diff>